<commit_message>
Prompts: add the title-screen picture (49 prompts)
Co-Authored-By: Claude Opus 5.5 <noreply@anthropic.com>
</commit_message>
<xml_diff>
--- a/ART_PROMPTS.docx
+++ b/ART_PROMPTS.docx
@@ -88,37 +88,37 @@
         <w:pageBreakBefore/>
       </w:pPr>
       <w:r>
-        <w:t xml:space="preserve">Characters (8)</w:t>
-      </w:r>
-    </w:p>
-    <w:p>
-      <w:pPr>
-        <w:pStyle w:val="Heading2"/>
-        <w:spacing w:after="80" w:before="240"/>
-      </w:pPr>
-      <w:r>
-        <w:t xml:space="preserve">1. Tinker</w:t>
-      </w:r>
-    </w:p>
-    <w:p>
-      <w:pPr>
-        <w:spacing w:after="120"/>
-      </w:pPr>
-      <w:r>
-        <w:rPr>
-          <w:b/>
-          <w:bCs/>
-          <w:sz w:val="24"/>
-          <w:szCs w:val="24"/>
-        </w:rPr>
-        <w:t xml:space="preserve">Save as: </w:t>
-      </w:r>
-      <w:r>
-        <w:rPr>
-          <w:sz w:val="24"/>
-          <w:szCs w:val="24"/>
-        </w:rPr>
-        <w:t xml:space="preserve">art/sheets/char-tinker.png</w:t>
+        <w:t xml:space="preserve">Title screen (1)</w:t>
+      </w:r>
+    </w:p>
+    <w:p>
+      <w:pPr>
+        <w:pStyle w:val="Heading2"/>
+        <w:spacing w:after="80" w:before="240"/>
+      </w:pPr>
+      <w:r>
+        <w:t xml:space="preserve">1. Title screen</w:t>
+      </w:r>
+    </w:p>
+    <w:p>
+      <w:pPr>
+        <w:spacing w:after="120"/>
+      </w:pPr>
+      <w:r>
+        <w:rPr>
+          <w:b/>
+          <w:bCs/>
+          <w:sz w:val="24"/>
+          <w:szCs w:val="24"/>
+        </w:rPr>
+        <w:t xml:space="preserve">Save as: </w:t>
+      </w:r>
+      <w:r>
+        <w:rPr>
+          <w:sz w:val="24"/>
+          <w:szCs w:val="24"/>
+        </w:rPr>
+        <w:t xml:space="preserve">art/sheets/title.png</w:t>
       </w:r>
     </w:p>
     <w:p>
@@ -156,483 +156,7 @@
           <w:sz w:val="24"/>
           <w:szCs w:val="24"/>
         </w:rPr>
-        <w:t xml:space="preserve">Stylised 3D game render, like a polished modern online kids' horror-escape game (hide-and-seek / murder-mystery style), for ages 8 and up. Realistic lighting and soft shadows, detailed materials (fabric, wood, plastic, metal), slightly chunky, appealing proportions. Creepy and tense but never gory: no blood, wounds, weapons or body horror. Not blocky toy avatars. No text, letters, logos, brand names or watermark. Character turnaround sheet of ONE child character, about 10 years old, full body, on a plain light grey background. Top row, four views, same size and pose height: front, three-quarter front, side, back. Bottom row, four poses: running, hiding (crouched, peeking), scared (jumping back), cheering. Same outfit and colours in all eight. An inventive kid in blue dungarees over an orange T-shirt, brass-rimmed workshop goggles pushed up on a blue cap worn slightly sideways, a tool belt with a small spanner and screwdriver, scuffed trainers. Curious, quick grin.</w:t>
-      </w:r>
-    </w:p>
-    <w:p>
-      <w:pPr>
-        <w:pStyle w:val="Heading2"/>
-        <w:spacing w:after="80" w:before="240"/>
-      </w:pPr>
-      <w:r>
-        <w:t xml:space="preserve">2. Shadow</w:t>
-      </w:r>
-    </w:p>
-    <w:p>
-      <w:pPr>
-        <w:spacing w:after="120"/>
-      </w:pPr>
-      <w:r>
-        <w:rPr>
-          <w:b/>
-          <w:bCs/>
-          <w:sz w:val="24"/>
-          <w:szCs w:val="24"/>
-        </w:rPr>
-        <w:t xml:space="preserve">Save as: </w:t>
-      </w:r>
-      <w:r>
-        <w:rPr>
-          <w:sz w:val="24"/>
-          <w:szCs w:val="24"/>
-        </w:rPr>
-        <w:t xml:space="preserve">art/sheets/char-shadow.png</w:t>
-      </w:r>
-    </w:p>
-    <w:p>
-      <w:pPr>
-        <w:spacing w:after="120"/>
-      </w:pPr>
-      <w:r>
-        <w:rPr>
-          <w:b/>
-          <w:bCs/>
-          <w:sz w:val="24"/>
-          <w:szCs w:val="24"/>
-        </w:rPr>
-        <w:t xml:space="preserve">Size: </w:t>
-      </w:r>
-      <w:r>
-        <w:rPr>
-          <w:sz w:val="24"/>
-          <w:szCs w:val="24"/>
-        </w:rPr>
-        <w:t xml:space="preserve">Wide (1536 x 1024)</w:t>
-      </w:r>
-    </w:p>
-    <w:p>
-      <w:pPr>
-        <w:pBdr>
-          <w:left w:val="single" w:color="8A6BD1" w:sz="18" w:space="8"/>
-        </w:pBdr>
-        <w:shd w:fill="F1ECF8" w:color="auto" w:val="clear"/>
-        <w:spacing w:after="200" w:before="60"/>
-      </w:pPr>
-      <w:r>
-        <w:rPr>
-          <w:rFonts w:ascii="Arial" w:cs="Arial" w:eastAsia="Arial" w:hAnsi="Arial"/>
-          <w:sz w:val="24"/>
-          <w:szCs w:val="24"/>
-        </w:rPr>
-        <w:t xml:space="preserve">Stylised 3D game render, like a polished modern online kids' horror-escape game (hide-and-seek / murder-mystery style), for ages 8 and up. Realistic lighting and soft shadows, detailed materials (fabric, wood, plastic, metal), slightly chunky, appealing proportions. Creepy and tense but never gory: no blood, wounds, weapons or body horror. Not blocky toy avatars. No text, letters, logos, brand names or watermark. Character turnaround sheet of ONE child character, about 10 years old, full body, on a plain light grey background. Top row, four views, same size and pose height: front, three-quarter front, side, back. Bottom row, four poses: running, hiding (crouched, peeking), scared (jumping back), cheering. Same outfit and colours in all eight. A quiet, sly kid in a dark purple hoodie with the hood up, a black cloth mask over the lower face, dark joggers and soft black sneakers, purple fingerless gloves. Moves like a cat.</w:t>
-      </w:r>
-    </w:p>
-    <w:p>
-      <w:pPr>
-        <w:pStyle w:val="Heading2"/>
-        <w:spacing w:after="80" w:before="240"/>
-      </w:pPr>
-      <w:r>
-        <w:t xml:space="preserve">3. Brainy</w:t>
-      </w:r>
-    </w:p>
-    <w:p>
-      <w:pPr>
-        <w:spacing w:after="120"/>
-      </w:pPr>
-      <w:r>
-        <w:rPr>
-          <w:b/>
-          <w:bCs/>
-          <w:sz w:val="24"/>
-          <w:szCs w:val="24"/>
-        </w:rPr>
-        <w:t xml:space="preserve">Save as: </w:t>
-      </w:r>
-      <w:r>
-        <w:rPr>
-          <w:sz w:val="24"/>
-          <w:szCs w:val="24"/>
-        </w:rPr>
-        <w:t xml:space="preserve">art/sheets/char-brainy.png</w:t>
-      </w:r>
-    </w:p>
-    <w:p>
-      <w:pPr>
-        <w:spacing w:after="120"/>
-      </w:pPr>
-      <w:r>
-        <w:rPr>
-          <w:b/>
-          <w:bCs/>
-          <w:sz w:val="24"/>
-          <w:szCs w:val="24"/>
-        </w:rPr>
-        <w:t xml:space="preserve">Size: </w:t>
-      </w:r>
-      <w:r>
-        <w:rPr>
-          <w:sz w:val="24"/>
-          <w:szCs w:val="24"/>
-        </w:rPr>
-        <w:t xml:space="preserve">Wide (1536 x 1024)</w:t>
-      </w:r>
-    </w:p>
-    <w:p>
-      <w:pPr>
-        <w:pBdr>
-          <w:left w:val="single" w:color="8A6BD1" w:sz="18" w:space="8"/>
-        </w:pBdr>
-        <w:shd w:fill="F1ECF8" w:color="auto" w:val="clear"/>
-        <w:spacing w:after="200" w:before="60"/>
-      </w:pPr>
-      <w:r>
-        <w:rPr>
-          <w:rFonts w:ascii="Arial" w:cs="Arial" w:eastAsia="Arial" w:hAnsi="Arial"/>
-          <w:sz w:val="24"/>
-          <w:szCs w:val="24"/>
-        </w:rPr>
-        <w:t xml:space="preserve">Stylised 3D game render, like a polished modern online kids' horror-escape game (hide-and-seek / murder-mystery style), for ages 8 and up. Realistic lighting and soft shadows, detailed materials (fabric, wood, plastic, metal), slightly chunky, appealing proportions. Creepy and tense but never gory: no blood, wounds, weapons or body horror. Not blocky toy avatars. No text, letters, logos, brand names or watermark. Character turnaround sheet of ONE child character, about 10 years old, full body, on a plain light grey background. Top row, four views, same size and pose height: front, three-quarter front, side, back. Bottom row, four poses: running, hiding (crouched, peeking), scared (jumping back), cheering. Same outfit and colours in all eight. A clever kid in a white lab coat over a sky-blue jumper, big round black glasses, a red beanie with a little blue propeller, a notebook and pencil behind the ear. Excitable.</w:t>
-      </w:r>
-    </w:p>
-    <w:p>
-      <w:pPr>
-        <w:pStyle w:val="Heading2"/>
-        <w:spacing w:after="80" w:before="240"/>
-      </w:pPr>
-      <w:r>
-        <w:t xml:space="preserve">4. Muscle</w:t>
-      </w:r>
-    </w:p>
-    <w:p>
-      <w:pPr>
-        <w:spacing w:after="120"/>
-      </w:pPr>
-      <w:r>
-        <w:rPr>
-          <w:b/>
-          <w:bCs/>
-          <w:sz w:val="24"/>
-          <w:szCs w:val="24"/>
-        </w:rPr>
-        <w:t xml:space="preserve">Save as: </w:t>
-      </w:r>
-      <w:r>
-        <w:rPr>
-          <w:sz w:val="24"/>
-          <w:szCs w:val="24"/>
-        </w:rPr>
-        <w:t xml:space="preserve">art/sheets/char-muscle.png</w:t>
-      </w:r>
-    </w:p>
-    <w:p>
-      <w:pPr>
-        <w:spacing w:after="120"/>
-      </w:pPr>
-      <w:r>
-        <w:rPr>
-          <w:b/>
-          <w:bCs/>
-          <w:sz w:val="24"/>
-          <w:szCs w:val="24"/>
-        </w:rPr>
-        <w:t xml:space="preserve">Size: </w:t>
-      </w:r>
-      <w:r>
-        <w:rPr>
-          <w:sz w:val="24"/>
-          <w:szCs w:val="24"/>
-        </w:rPr>
-        <w:t xml:space="preserve">Wide (1536 x 1024)</w:t>
-      </w:r>
-    </w:p>
-    <w:p>
-      <w:pPr>
-        <w:pBdr>
-          <w:left w:val="single" w:color="8A6BD1" w:sz="18" w:space="8"/>
-        </w:pBdr>
-        <w:shd w:fill="F1ECF8" w:color="auto" w:val="clear"/>
-        <w:spacing w:after="200" w:before="60"/>
-      </w:pPr>
-      <w:r>
-        <w:rPr>
-          <w:rFonts w:ascii="Arial" w:cs="Arial" w:eastAsia="Arial" w:hAnsi="Arial"/>
-          <w:sz w:val="24"/>
-          <w:szCs w:val="24"/>
-        </w:rPr>
-        <w:t xml:space="preserve">Stylised 3D game render, like a polished modern online kids' horror-escape game (hide-and-seek / murder-mystery style), for ages 8 and up. Realistic lighting and soft shadows, detailed materials (fabric, wood, plastic, metal), slightly chunky, appealing proportions. Creepy and tense but never gory: no blood, wounds, weapons or body horror. Not blocky toy avatars. No text, letters, logos, brand names or watermark. Character turnaround sheet of ONE child character, about 10 years old, full body, on a plain light grey background. Top row, four views, same size and pose height: front, three-quarter front, side, back. Bottom row, four poses: running, hiding (crouched, peeking), scared (jumping back), cheering. Same outfit and colours in all eight. A strong, kind kid in a red sports jersey with no team name, charcoal shorts, a yellow sweatband, high-top trainers, rolled-up sleeves. Confident.</w:t>
-      </w:r>
-    </w:p>
-    <w:p>
-      <w:pPr>
-        <w:pStyle w:val="Heading2"/>
-        <w:spacing w:after="80" w:before="240"/>
-      </w:pPr>
-      <w:r>
-        <w:t xml:space="preserve">5. Glow</w:t>
-      </w:r>
-    </w:p>
-    <w:p>
-      <w:pPr>
-        <w:spacing w:after="120"/>
-      </w:pPr>
-      <w:r>
-        <w:rPr>
-          <w:b/>
-          <w:bCs/>
-          <w:sz w:val="24"/>
-          <w:szCs w:val="24"/>
-        </w:rPr>
-        <w:t xml:space="preserve">Save as: </w:t>
-      </w:r>
-      <w:r>
-        <w:rPr>
-          <w:sz w:val="24"/>
-          <w:szCs w:val="24"/>
-        </w:rPr>
-        <w:t xml:space="preserve">art/sheets/char-glow.png</w:t>
-      </w:r>
-    </w:p>
-    <w:p>
-      <w:pPr>
-        <w:spacing w:after="120"/>
-      </w:pPr>
-      <w:r>
-        <w:rPr>
-          <w:b/>
-          <w:bCs/>
-          <w:sz w:val="24"/>
-          <w:szCs w:val="24"/>
-        </w:rPr>
-        <w:t xml:space="preserve">Size: </w:t>
-      </w:r>
-      <w:r>
-        <w:rPr>
-          <w:sz w:val="24"/>
-          <w:szCs w:val="24"/>
-        </w:rPr>
-        <w:t xml:space="preserve">Wide (1536 x 1024)</w:t>
-      </w:r>
-    </w:p>
-    <w:p>
-      <w:pPr>
-        <w:pBdr>
-          <w:left w:val="single" w:color="8A6BD1" w:sz="18" w:space="8"/>
-        </w:pBdr>
-        <w:shd w:fill="F1ECF8" w:color="auto" w:val="clear"/>
-        <w:spacing w:after="200" w:before="60"/>
-      </w:pPr>
-      <w:r>
-        <w:rPr>
-          <w:rFonts w:ascii="Arial" w:cs="Arial" w:eastAsia="Arial" w:hAnsi="Arial"/>
-          <w:sz w:val="24"/>
-          <w:szCs w:val="24"/>
-        </w:rPr>
-        <w:t xml:space="preserve">Stylised 3D game render, like a polished modern online kids' horror-escape game (hide-and-seek / murder-mystery style), for ages 8 and up. Realistic lighting and soft shadows, detailed materials (fabric, wood, plastic, metal), slightly chunky, appealing proportions. Creepy and tense but never gory: no blood, wounds, weapons or body horror. Not blocky toy avatars. No text, letters, logos, brand names or watermark. Character turnaround sheet of ONE child character, about 10 years old, full body, on a plain light grey background. Top row, four views, same size and pose height: front, three-quarter front, side, back. Bottom row, four poses: running, hiding (crouched, peeking), scared (jumping back), cheering. Same outfit and colours in all eight. A gentle kid in a lime-green glow-in-the-dark raincoat, a headband with a curly antenna and a glowing bulb, a head torch around the neck, green wellies. Bright eyes.</w:t>
-      </w:r>
-    </w:p>
-    <w:p>
-      <w:pPr>
-        <w:pStyle w:val="Heading2"/>
-        <w:spacing w:after="80" w:before="240"/>
-      </w:pPr>
-      <w:r>
-        <w:t xml:space="preserve">6. Patch</w:t>
-      </w:r>
-    </w:p>
-    <w:p>
-      <w:pPr>
-        <w:spacing w:after="120"/>
-      </w:pPr>
-      <w:r>
-        <w:rPr>
-          <w:b/>
-          <w:bCs/>
-          <w:sz w:val="24"/>
-          <w:szCs w:val="24"/>
-        </w:rPr>
-        <w:t xml:space="preserve">Save as: </w:t>
-      </w:r>
-      <w:r>
-        <w:rPr>
-          <w:sz w:val="24"/>
-          <w:szCs w:val="24"/>
-        </w:rPr>
-        <w:t xml:space="preserve">art/sheets/char-patch.png</w:t>
-      </w:r>
-    </w:p>
-    <w:p>
-      <w:pPr>
-        <w:spacing w:after="120"/>
-      </w:pPr>
-      <w:r>
-        <w:rPr>
-          <w:b/>
-          <w:bCs/>
-          <w:sz w:val="24"/>
-          <w:szCs w:val="24"/>
-        </w:rPr>
-        <w:t xml:space="preserve">Size: </w:t>
-      </w:r>
-      <w:r>
-        <w:rPr>
-          <w:sz w:val="24"/>
-          <w:szCs w:val="24"/>
-        </w:rPr>
-        <w:t xml:space="preserve">Wide (1536 x 1024)</w:t>
-      </w:r>
-    </w:p>
-    <w:p>
-      <w:pPr>
-        <w:pBdr>
-          <w:left w:val="single" w:color="8A6BD1" w:sz="18" w:space="8"/>
-        </w:pBdr>
-        <w:shd w:fill="F1ECF8" w:color="auto" w:val="clear"/>
-        <w:spacing w:after="200" w:before="60"/>
-      </w:pPr>
-      <w:r>
-        <w:rPr>
-          <w:rFonts w:ascii="Arial" w:cs="Arial" w:eastAsia="Arial" w:hAnsi="Arial"/>
-          <w:sz w:val="24"/>
-          <w:szCs w:val="24"/>
-        </w:rPr>
-        <w:t xml:space="preserve">Stylised 3D game render, like a polished modern online kids' horror-escape game (hide-and-seek / murder-mystery style), for ages 8 and up. Realistic lighting and soft shadows, detailed materials (fabric, wood, plastic, metal), slightly chunky, appealing proportions. Creepy and tense but never gory: no blood, wounds, weapons or body horror. Not blocky toy avatars. No text, letters, logos, brand names or watermark. Character turnaround sheet of ONE child character, about 10 years old, full body, on a plain light grey background. Top row, four views, same size and pose height: front, three-quarter front, side, back. Bottom row, four poses: running, hiding (crouched, peeking), scared (jumping back), cheering. Same outfit and colours in all eight. A caring kid in a pink medic-style vest over a white top, a sticking plaster on the forehead, a small first-aid satchel with a heart (no red cross), comfy trainers.</w:t>
-      </w:r>
-    </w:p>
-    <w:p>
-      <w:pPr>
-        <w:pStyle w:val="Heading2"/>
-        <w:spacing w:after="80" w:before="240"/>
-      </w:pPr>
-      <w:r>
-        <w:t xml:space="preserve">7. Echo</w:t>
-      </w:r>
-    </w:p>
-    <w:p>
-      <w:pPr>
-        <w:spacing w:after="120"/>
-      </w:pPr>
-      <w:r>
-        <w:rPr>
-          <w:b/>
-          <w:bCs/>
-          <w:sz w:val="24"/>
-          <w:szCs w:val="24"/>
-        </w:rPr>
-        <w:t xml:space="preserve">Save as: </w:t>
-      </w:r>
-      <w:r>
-        <w:rPr>
-          <w:sz w:val="24"/>
-          <w:szCs w:val="24"/>
-        </w:rPr>
-        <w:t xml:space="preserve">art/sheets/char-echo.png</w:t>
-      </w:r>
-    </w:p>
-    <w:p>
-      <w:pPr>
-        <w:spacing w:after="120"/>
-      </w:pPr>
-      <w:r>
-        <w:rPr>
-          <w:b/>
-          <w:bCs/>
-          <w:sz w:val="24"/>
-          <w:szCs w:val="24"/>
-        </w:rPr>
-        <w:t xml:space="preserve">Size: </w:t>
-      </w:r>
-      <w:r>
-        <w:rPr>
-          <w:sz w:val="24"/>
-          <w:szCs w:val="24"/>
-        </w:rPr>
-        <w:t xml:space="preserve">Wide (1536 x 1024)</w:t>
-      </w:r>
-    </w:p>
-    <w:p>
-      <w:pPr>
-        <w:pBdr>
-          <w:left w:val="single" w:color="8A6BD1" w:sz="18" w:space="8"/>
-        </w:pBdr>
-        <w:shd w:fill="F1ECF8" w:color="auto" w:val="clear"/>
-        <w:spacing w:after="200" w:before="60"/>
-      </w:pPr>
-      <w:r>
-        <w:rPr>
-          <w:rFonts w:ascii="Arial" w:cs="Arial" w:eastAsia="Arial" w:hAnsi="Arial"/>
-          <w:sz w:val="24"/>
-          <w:szCs w:val="24"/>
-        </w:rPr>
-        <w:t xml:space="preserve">Stylised 3D game render, like a polished modern online kids' horror-escape game (hide-and-seek / murder-mystery style), for ages 8 and up. Realistic lighting and soft shadows, detailed materials (fabric, wood, plastic, metal), slightly chunky, appealing proportions. Creepy and tense but never gory: no blood, wounds, weapons or body horror. Not blocky toy avatars. No text, letters, logos, brand names or watermark. Character turnaround sheet of ONE child character, about 10 years old, full body, on a plain light grey background. Top row, four views, same size and pose height: front, three-quarter front, side, back. Bottom row, four poses: running, hiding (crouched, peeking), scared (jumping back), cheering. Same outfit and colours in all eight. A watchful kid in a yellow bomber jacket and purple trousers, big dark headphones around the neck, round goggles, a little handheld sound gadget.</w:t>
-      </w:r>
-    </w:p>
-    <w:p>
-      <w:pPr>
-        <w:pStyle w:val="Heading2"/>
-        <w:spacing w:after="80" w:before="240"/>
-      </w:pPr>
-      <w:r>
-        <w:t xml:space="preserve">8. Bramble</w:t>
-      </w:r>
-    </w:p>
-    <w:p>
-      <w:pPr>
-        <w:spacing w:after="120"/>
-      </w:pPr>
-      <w:r>
-        <w:rPr>
-          <w:b/>
-          <w:bCs/>
-          <w:sz w:val="24"/>
-          <w:szCs w:val="24"/>
-        </w:rPr>
-        <w:t xml:space="preserve">Save as: </w:t>
-      </w:r>
-      <w:r>
-        <w:rPr>
-          <w:sz w:val="24"/>
-          <w:szCs w:val="24"/>
-        </w:rPr>
-        <w:t xml:space="preserve">art/sheets/char-bramble.png</w:t>
-      </w:r>
-    </w:p>
-    <w:p>
-      <w:pPr>
-        <w:spacing w:after="120"/>
-      </w:pPr>
-      <w:r>
-        <w:rPr>
-          <w:b/>
-          <w:bCs/>
-          <w:sz w:val="24"/>
-          <w:szCs w:val="24"/>
-        </w:rPr>
-        <w:t xml:space="preserve">Size: </w:t>
-      </w:r>
-      <w:r>
-        <w:rPr>
-          <w:sz w:val="24"/>
-          <w:szCs w:val="24"/>
-        </w:rPr>
-        <w:t xml:space="preserve">Wide (1536 x 1024)</w:t>
-      </w:r>
-    </w:p>
-    <w:p>
-      <w:pPr>
-        <w:pBdr>
-          <w:left w:val="single" w:color="8A6BD1" w:sz="18" w:space="8"/>
-        </w:pBdr>
-        <w:shd w:fill="F1ECF8" w:color="auto" w:val="clear"/>
-        <w:spacing w:after="200" w:before="60"/>
-      </w:pPr>
-      <w:r>
-        <w:rPr>
-          <w:rFonts w:ascii="Arial" w:cs="Arial" w:eastAsia="Arial" w:hAnsi="Arial"/>
-          <w:sz w:val="24"/>
-          <w:szCs w:val="24"/>
-        </w:rPr>
-        <w:t xml:space="preserve">Stylised 3D game render, like a polished modern online kids' horror-escape game (hide-and-seek / murder-mystery style), for ages 8 and up. Realistic lighting and soft shadows, detailed materials (fabric, wood, plastic, metal), slightly chunky, appealing proportions. Creepy and tense but never gory: no blood, wounds, weapons or body horror. Not blocky toy avatars. No text, letters, logos, brand names or watermark. Character turnaround sheet of ONE child character, about 10 years old, full body, on a plain light grey background. Top row, four views, same size and pose height: front, three-quarter front, side, back. Bottom row, four poses: running, hiding (crouched, peeking), scared (jumping back), cheering. Same outfit and colours in all eight. An outdoorsy kid in a leaf-green poncho and brown cargo shorts, a crown of real leaves and one small flower in the hair, muddy boots, a pouch of seeds. Calm.</w:t>
+        <w:t xml:space="preserve">Stylised 3D game render, like a polished modern online kids' horror-escape game (hide-and-seek / murder-mystery style), for ages 8 and up. Realistic lighting and soft shadows, detailed materials (fabric, wood, plastic, metal), slightly chunky, appealing proportions. Creepy and tense but never gory: no blood, wounds, weapons or body horror. Not blocky toy avatars. No text, letters, logos, brand names or watermark. Wide title-screen scene at night: a tall, crooked Victorian house at the end of a dark country lane, warm flickering light in some windows, bunting and party balloons tied to the front gate, a big full moon behind drifting clouds, low fog rolling across the lane. In one upstairs window, the silhouette of a very tall figure with a glowing carved-pumpkin head and a crooked party hat is watching. Three children seen from behind, holding torches, stand on the lane looking up at the house. Keep the left third of the picture darker and simpler (sky, fog, hedges) so menu buttons can sit there; the house is on the right.</w:t>
       </w:r>
     </w:p>
     <w:p>
@@ -641,6 +165,559 @@
         <w:pageBreakBefore/>
       </w:pPr>
       <w:r>
+        <w:t xml:space="preserve">Characters (8)</w:t>
+      </w:r>
+    </w:p>
+    <w:p>
+      <w:pPr>
+        <w:pStyle w:val="Heading2"/>
+        <w:spacing w:after="80" w:before="240"/>
+      </w:pPr>
+      <w:r>
+        <w:t xml:space="preserve">2. Tinker</w:t>
+      </w:r>
+    </w:p>
+    <w:p>
+      <w:pPr>
+        <w:spacing w:after="120"/>
+      </w:pPr>
+      <w:r>
+        <w:rPr>
+          <w:b/>
+          <w:bCs/>
+          <w:sz w:val="24"/>
+          <w:szCs w:val="24"/>
+        </w:rPr>
+        <w:t xml:space="preserve">Save as: </w:t>
+      </w:r>
+      <w:r>
+        <w:rPr>
+          <w:sz w:val="24"/>
+          <w:szCs w:val="24"/>
+        </w:rPr>
+        <w:t xml:space="preserve">art/sheets/char-tinker.png</w:t>
+      </w:r>
+    </w:p>
+    <w:p>
+      <w:pPr>
+        <w:spacing w:after="120"/>
+      </w:pPr>
+      <w:r>
+        <w:rPr>
+          <w:b/>
+          <w:bCs/>
+          <w:sz w:val="24"/>
+          <w:szCs w:val="24"/>
+        </w:rPr>
+        <w:t xml:space="preserve">Size: </w:t>
+      </w:r>
+      <w:r>
+        <w:rPr>
+          <w:sz w:val="24"/>
+          <w:szCs w:val="24"/>
+        </w:rPr>
+        <w:t xml:space="preserve">Wide (1536 x 1024)</w:t>
+      </w:r>
+    </w:p>
+    <w:p>
+      <w:pPr>
+        <w:pBdr>
+          <w:left w:val="single" w:color="8A6BD1" w:sz="18" w:space="8"/>
+        </w:pBdr>
+        <w:shd w:fill="F1ECF8" w:color="auto" w:val="clear"/>
+        <w:spacing w:after="200" w:before="60"/>
+      </w:pPr>
+      <w:r>
+        <w:rPr>
+          <w:rFonts w:ascii="Arial" w:cs="Arial" w:eastAsia="Arial" w:hAnsi="Arial"/>
+          <w:sz w:val="24"/>
+          <w:szCs w:val="24"/>
+        </w:rPr>
+        <w:t xml:space="preserve">Stylised 3D game render, like a polished modern online kids' horror-escape game (hide-and-seek / murder-mystery style), for ages 8 and up. Realistic lighting and soft shadows, detailed materials (fabric, wood, plastic, metal), slightly chunky, appealing proportions. Creepy and tense but never gory: no blood, wounds, weapons or body horror. Not blocky toy avatars. No text, letters, logos, brand names or watermark. Character turnaround sheet of ONE child character, about 10 years old, full body, on a plain light grey background. Top row, four views, same size and pose height: front, three-quarter front, side, back. Bottom row, four poses: running, hiding (crouched, peeking), scared (jumping back), cheering. Same outfit and colours in all eight. An inventive kid in blue dungarees over an orange T-shirt, brass-rimmed workshop goggles pushed up on a blue cap worn slightly sideways, a tool belt with a small spanner and screwdriver, scuffed trainers. Curious, quick grin.</w:t>
+      </w:r>
+    </w:p>
+    <w:p>
+      <w:pPr>
+        <w:pStyle w:val="Heading2"/>
+        <w:spacing w:after="80" w:before="240"/>
+      </w:pPr>
+      <w:r>
+        <w:t xml:space="preserve">3. Shadow</w:t>
+      </w:r>
+    </w:p>
+    <w:p>
+      <w:pPr>
+        <w:spacing w:after="120"/>
+      </w:pPr>
+      <w:r>
+        <w:rPr>
+          <w:b/>
+          <w:bCs/>
+          <w:sz w:val="24"/>
+          <w:szCs w:val="24"/>
+        </w:rPr>
+        <w:t xml:space="preserve">Save as: </w:t>
+      </w:r>
+      <w:r>
+        <w:rPr>
+          <w:sz w:val="24"/>
+          <w:szCs w:val="24"/>
+        </w:rPr>
+        <w:t xml:space="preserve">art/sheets/char-shadow.png</w:t>
+      </w:r>
+    </w:p>
+    <w:p>
+      <w:pPr>
+        <w:spacing w:after="120"/>
+      </w:pPr>
+      <w:r>
+        <w:rPr>
+          <w:b/>
+          <w:bCs/>
+          <w:sz w:val="24"/>
+          <w:szCs w:val="24"/>
+        </w:rPr>
+        <w:t xml:space="preserve">Size: </w:t>
+      </w:r>
+      <w:r>
+        <w:rPr>
+          <w:sz w:val="24"/>
+          <w:szCs w:val="24"/>
+        </w:rPr>
+        <w:t xml:space="preserve">Wide (1536 x 1024)</w:t>
+      </w:r>
+    </w:p>
+    <w:p>
+      <w:pPr>
+        <w:pBdr>
+          <w:left w:val="single" w:color="8A6BD1" w:sz="18" w:space="8"/>
+        </w:pBdr>
+        <w:shd w:fill="F1ECF8" w:color="auto" w:val="clear"/>
+        <w:spacing w:after="200" w:before="60"/>
+      </w:pPr>
+      <w:r>
+        <w:rPr>
+          <w:rFonts w:ascii="Arial" w:cs="Arial" w:eastAsia="Arial" w:hAnsi="Arial"/>
+          <w:sz w:val="24"/>
+          <w:szCs w:val="24"/>
+        </w:rPr>
+        <w:t xml:space="preserve">Stylised 3D game render, like a polished modern online kids' horror-escape game (hide-and-seek / murder-mystery style), for ages 8 and up. Realistic lighting and soft shadows, detailed materials (fabric, wood, plastic, metal), slightly chunky, appealing proportions. Creepy and tense but never gory: no blood, wounds, weapons or body horror. Not blocky toy avatars. No text, letters, logos, brand names or watermark. Character turnaround sheet of ONE child character, about 10 years old, full body, on a plain light grey background. Top row, four views, same size and pose height: front, three-quarter front, side, back. Bottom row, four poses: running, hiding (crouched, peeking), scared (jumping back), cheering. Same outfit and colours in all eight. A quiet, sly kid in a dark purple hoodie with the hood up, a black cloth mask over the lower face, dark joggers and soft black sneakers, purple fingerless gloves. Moves like a cat.</w:t>
+      </w:r>
+    </w:p>
+    <w:p>
+      <w:pPr>
+        <w:pStyle w:val="Heading2"/>
+        <w:spacing w:after="80" w:before="240"/>
+      </w:pPr>
+      <w:r>
+        <w:t xml:space="preserve">4. Brainy</w:t>
+      </w:r>
+    </w:p>
+    <w:p>
+      <w:pPr>
+        <w:spacing w:after="120"/>
+      </w:pPr>
+      <w:r>
+        <w:rPr>
+          <w:b/>
+          <w:bCs/>
+          <w:sz w:val="24"/>
+          <w:szCs w:val="24"/>
+        </w:rPr>
+        <w:t xml:space="preserve">Save as: </w:t>
+      </w:r>
+      <w:r>
+        <w:rPr>
+          <w:sz w:val="24"/>
+          <w:szCs w:val="24"/>
+        </w:rPr>
+        <w:t xml:space="preserve">art/sheets/char-brainy.png</w:t>
+      </w:r>
+    </w:p>
+    <w:p>
+      <w:pPr>
+        <w:spacing w:after="120"/>
+      </w:pPr>
+      <w:r>
+        <w:rPr>
+          <w:b/>
+          <w:bCs/>
+          <w:sz w:val="24"/>
+          <w:szCs w:val="24"/>
+        </w:rPr>
+        <w:t xml:space="preserve">Size: </w:t>
+      </w:r>
+      <w:r>
+        <w:rPr>
+          <w:sz w:val="24"/>
+          <w:szCs w:val="24"/>
+        </w:rPr>
+        <w:t xml:space="preserve">Wide (1536 x 1024)</w:t>
+      </w:r>
+    </w:p>
+    <w:p>
+      <w:pPr>
+        <w:pBdr>
+          <w:left w:val="single" w:color="8A6BD1" w:sz="18" w:space="8"/>
+        </w:pBdr>
+        <w:shd w:fill="F1ECF8" w:color="auto" w:val="clear"/>
+        <w:spacing w:after="200" w:before="60"/>
+      </w:pPr>
+      <w:r>
+        <w:rPr>
+          <w:rFonts w:ascii="Arial" w:cs="Arial" w:eastAsia="Arial" w:hAnsi="Arial"/>
+          <w:sz w:val="24"/>
+          <w:szCs w:val="24"/>
+        </w:rPr>
+        <w:t xml:space="preserve">Stylised 3D game render, like a polished modern online kids' horror-escape game (hide-and-seek / murder-mystery style), for ages 8 and up. Realistic lighting and soft shadows, detailed materials (fabric, wood, plastic, metal), slightly chunky, appealing proportions. Creepy and tense but never gory: no blood, wounds, weapons or body horror. Not blocky toy avatars. No text, letters, logos, brand names or watermark. Character turnaround sheet of ONE child character, about 10 years old, full body, on a plain light grey background. Top row, four views, same size and pose height: front, three-quarter front, side, back. Bottom row, four poses: running, hiding (crouched, peeking), scared (jumping back), cheering. Same outfit and colours in all eight. A clever kid in a white lab coat over a sky-blue jumper, big round black glasses, a red beanie with a little blue propeller, a notebook and pencil behind the ear. Excitable.</w:t>
+      </w:r>
+    </w:p>
+    <w:p>
+      <w:pPr>
+        <w:pStyle w:val="Heading2"/>
+        <w:spacing w:after="80" w:before="240"/>
+      </w:pPr>
+      <w:r>
+        <w:t xml:space="preserve">5. Muscle</w:t>
+      </w:r>
+    </w:p>
+    <w:p>
+      <w:pPr>
+        <w:spacing w:after="120"/>
+      </w:pPr>
+      <w:r>
+        <w:rPr>
+          <w:b/>
+          <w:bCs/>
+          <w:sz w:val="24"/>
+          <w:szCs w:val="24"/>
+        </w:rPr>
+        <w:t xml:space="preserve">Save as: </w:t>
+      </w:r>
+      <w:r>
+        <w:rPr>
+          <w:sz w:val="24"/>
+          <w:szCs w:val="24"/>
+        </w:rPr>
+        <w:t xml:space="preserve">art/sheets/char-muscle.png</w:t>
+      </w:r>
+    </w:p>
+    <w:p>
+      <w:pPr>
+        <w:spacing w:after="120"/>
+      </w:pPr>
+      <w:r>
+        <w:rPr>
+          <w:b/>
+          <w:bCs/>
+          <w:sz w:val="24"/>
+          <w:szCs w:val="24"/>
+        </w:rPr>
+        <w:t xml:space="preserve">Size: </w:t>
+      </w:r>
+      <w:r>
+        <w:rPr>
+          <w:sz w:val="24"/>
+          <w:szCs w:val="24"/>
+        </w:rPr>
+        <w:t xml:space="preserve">Wide (1536 x 1024)</w:t>
+      </w:r>
+    </w:p>
+    <w:p>
+      <w:pPr>
+        <w:pBdr>
+          <w:left w:val="single" w:color="8A6BD1" w:sz="18" w:space="8"/>
+        </w:pBdr>
+        <w:shd w:fill="F1ECF8" w:color="auto" w:val="clear"/>
+        <w:spacing w:after="200" w:before="60"/>
+      </w:pPr>
+      <w:r>
+        <w:rPr>
+          <w:rFonts w:ascii="Arial" w:cs="Arial" w:eastAsia="Arial" w:hAnsi="Arial"/>
+          <w:sz w:val="24"/>
+          <w:szCs w:val="24"/>
+        </w:rPr>
+        <w:t xml:space="preserve">Stylised 3D game render, like a polished modern online kids' horror-escape game (hide-and-seek / murder-mystery style), for ages 8 and up. Realistic lighting and soft shadows, detailed materials (fabric, wood, plastic, metal), slightly chunky, appealing proportions. Creepy and tense but never gory: no blood, wounds, weapons or body horror. Not blocky toy avatars. No text, letters, logos, brand names or watermark. Character turnaround sheet of ONE child character, about 10 years old, full body, on a plain light grey background. Top row, four views, same size and pose height: front, three-quarter front, side, back. Bottom row, four poses: running, hiding (crouched, peeking), scared (jumping back), cheering. Same outfit and colours in all eight. A strong, kind kid in a red sports jersey with no team name, charcoal shorts, a yellow sweatband, high-top trainers, rolled-up sleeves. Confident.</w:t>
+      </w:r>
+    </w:p>
+    <w:p>
+      <w:pPr>
+        <w:pStyle w:val="Heading2"/>
+        <w:spacing w:after="80" w:before="240"/>
+      </w:pPr>
+      <w:r>
+        <w:t xml:space="preserve">6. Glow</w:t>
+      </w:r>
+    </w:p>
+    <w:p>
+      <w:pPr>
+        <w:spacing w:after="120"/>
+      </w:pPr>
+      <w:r>
+        <w:rPr>
+          <w:b/>
+          <w:bCs/>
+          <w:sz w:val="24"/>
+          <w:szCs w:val="24"/>
+        </w:rPr>
+        <w:t xml:space="preserve">Save as: </w:t>
+      </w:r>
+      <w:r>
+        <w:rPr>
+          <w:sz w:val="24"/>
+          <w:szCs w:val="24"/>
+        </w:rPr>
+        <w:t xml:space="preserve">art/sheets/char-glow.png</w:t>
+      </w:r>
+    </w:p>
+    <w:p>
+      <w:pPr>
+        <w:spacing w:after="120"/>
+      </w:pPr>
+      <w:r>
+        <w:rPr>
+          <w:b/>
+          <w:bCs/>
+          <w:sz w:val="24"/>
+          <w:szCs w:val="24"/>
+        </w:rPr>
+        <w:t xml:space="preserve">Size: </w:t>
+      </w:r>
+      <w:r>
+        <w:rPr>
+          <w:sz w:val="24"/>
+          <w:szCs w:val="24"/>
+        </w:rPr>
+        <w:t xml:space="preserve">Wide (1536 x 1024)</w:t>
+      </w:r>
+    </w:p>
+    <w:p>
+      <w:pPr>
+        <w:pBdr>
+          <w:left w:val="single" w:color="8A6BD1" w:sz="18" w:space="8"/>
+        </w:pBdr>
+        <w:shd w:fill="F1ECF8" w:color="auto" w:val="clear"/>
+        <w:spacing w:after="200" w:before="60"/>
+      </w:pPr>
+      <w:r>
+        <w:rPr>
+          <w:rFonts w:ascii="Arial" w:cs="Arial" w:eastAsia="Arial" w:hAnsi="Arial"/>
+          <w:sz w:val="24"/>
+          <w:szCs w:val="24"/>
+        </w:rPr>
+        <w:t xml:space="preserve">Stylised 3D game render, like a polished modern online kids' horror-escape game (hide-and-seek / murder-mystery style), for ages 8 and up. Realistic lighting and soft shadows, detailed materials (fabric, wood, plastic, metal), slightly chunky, appealing proportions. Creepy and tense but never gory: no blood, wounds, weapons or body horror. Not blocky toy avatars. No text, letters, logos, brand names or watermark. Character turnaround sheet of ONE child character, about 10 years old, full body, on a plain light grey background. Top row, four views, same size and pose height: front, three-quarter front, side, back. Bottom row, four poses: running, hiding (crouched, peeking), scared (jumping back), cheering. Same outfit and colours in all eight. A gentle kid in a lime-green glow-in-the-dark raincoat, a headband with a curly antenna and a glowing bulb, a head torch around the neck, green wellies. Bright eyes.</w:t>
+      </w:r>
+    </w:p>
+    <w:p>
+      <w:pPr>
+        <w:pStyle w:val="Heading2"/>
+        <w:spacing w:after="80" w:before="240"/>
+      </w:pPr>
+      <w:r>
+        <w:t xml:space="preserve">7. Patch</w:t>
+      </w:r>
+    </w:p>
+    <w:p>
+      <w:pPr>
+        <w:spacing w:after="120"/>
+      </w:pPr>
+      <w:r>
+        <w:rPr>
+          <w:b/>
+          <w:bCs/>
+          <w:sz w:val="24"/>
+          <w:szCs w:val="24"/>
+        </w:rPr>
+        <w:t xml:space="preserve">Save as: </w:t>
+      </w:r>
+      <w:r>
+        <w:rPr>
+          <w:sz w:val="24"/>
+          <w:szCs w:val="24"/>
+        </w:rPr>
+        <w:t xml:space="preserve">art/sheets/char-patch.png</w:t>
+      </w:r>
+    </w:p>
+    <w:p>
+      <w:pPr>
+        <w:spacing w:after="120"/>
+      </w:pPr>
+      <w:r>
+        <w:rPr>
+          <w:b/>
+          <w:bCs/>
+          <w:sz w:val="24"/>
+          <w:szCs w:val="24"/>
+        </w:rPr>
+        <w:t xml:space="preserve">Size: </w:t>
+      </w:r>
+      <w:r>
+        <w:rPr>
+          <w:sz w:val="24"/>
+          <w:szCs w:val="24"/>
+        </w:rPr>
+        <w:t xml:space="preserve">Wide (1536 x 1024)</w:t>
+      </w:r>
+    </w:p>
+    <w:p>
+      <w:pPr>
+        <w:pBdr>
+          <w:left w:val="single" w:color="8A6BD1" w:sz="18" w:space="8"/>
+        </w:pBdr>
+        <w:shd w:fill="F1ECF8" w:color="auto" w:val="clear"/>
+        <w:spacing w:after="200" w:before="60"/>
+      </w:pPr>
+      <w:r>
+        <w:rPr>
+          <w:rFonts w:ascii="Arial" w:cs="Arial" w:eastAsia="Arial" w:hAnsi="Arial"/>
+          <w:sz w:val="24"/>
+          <w:szCs w:val="24"/>
+        </w:rPr>
+        <w:t xml:space="preserve">Stylised 3D game render, like a polished modern online kids' horror-escape game (hide-and-seek / murder-mystery style), for ages 8 and up. Realistic lighting and soft shadows, detailed materials (fabric, wood, plastic, metal), slightly chunky, appealing proportions. Creepy and tense but never gory: no blood, wounds, weapons or body horror. Not blocky toy avatars. No text, letters, logos, brand names or watermark. Character turnaround sheet of ONE child character, about 10 years old, full body, on a plain light grey background. Top row, four views, same size and pose height: front, three-quarter front, side, back. Bottom row, four poses: running, hiding (crouched, peeking), scared (jumping back), cheering. Same outfit and colours in all eight. A caring kid in a pink medic-style vest over a white top, a sticking plaster on the forehead, a small first-aid satchel with a heart (no red cross), comfy trainers.</w:t>
+      </w:r>
+    </w:p>
+    <w:p>
+      <w:pPr>
+        <w:pStyle w:val="Heading2"/>
+        <w:spacing w:after="80" w:before="240"/>
+      </w:pPr>
+      <w:r>
+        <w:t xml:space="preserve">8. Echo</w:t>
+      </w:r>
+    </w:p>
+    <w:p>
+      <w:pPr>
+        <w:spacing w:after="120"/>
+      </w:pPr>
+      <w:r>
+        <w:rPr>
+          <w:b/>
+          <w:bCs/>
+          <w:sz w:val="24"/>
+          <w:szCs w:val="24"/>
+        </w:rPr>
+        <w:t xml:space="preserve">Save as: </w:t>
+      </w:r>
+      <w:r>
+        <w:rPr>
+          <w:sz w:val="24"/>
+          <w:szCs w:val="24"/>
+        </w:rPr>
+        <w:t xml:space="preserve">art/sheets/char-echo.png</w:t>
+      </w:r>
+    </w:p>
+    <w:p>
+      <w:pPr>
+        <w:spacing w:after="120"/>
+      </w:pPr>
+      <w:r>
+        <w:rPr>
+          <w:b/>
+          <w:bCs/>
+          <w:sz w:val="24"/>
+          <w:szCs w:val="24"/>
+        </w:rPr>
+        <w:t xml:space="preserve">Size: </w:t>
+      </w:r>
+      <w:r>
+        <w:rPr>
+          <w:sz w:val="24"/>
+          <w:szCs w:val="24"/>
+        </w:rPr>
+        <w:t xml:space="preserve">Wide (1536 x 1024)</w:t>
+      </w:r>
+    </w:p>
+    <w:p>
+      <w:pPr>
+        <w:pBdr>
+          <w:left w:val="single" w:color="8A6BD1" w:sz="18" w:space="8"/>
+        </w:pBdr>
+        <w:shd w:fill="F1ECF8" w:color="auto" w:val="clear"/>
+        <w:spacing w:after="200" w:before="60"/>
+      </w:pPr>
+      <w:r>
+        <w:rPr>
+          <w:rFonts w:ascii="Arial" w:cs="Arial" w:eastAsia="Arial" w:hAnsi="Arial"/>
+          <w:sz w:val="24"/>
+          <w:szCs w:val="24"/>
+        </w:rPr>
+        <w:t xml:space="preserve">Stylised 3D game render, like a polished modern online kids' horror-escape game (hide-and-seek / murder-mystery style), for ages 8 and up. Realistic lighting and soft shadows, detailed materials (fabric, wood, plastic, metal), slightly chunky, appealing proportions. Creepy and tense but never gory: no blood, wounds, weapons or body horror. Not blocky toy avatars. No text, letters, logos, brand names or watermark. Character turnaround sheet of ONE child character, about 10 years old, full body, on a plain light grey background. Top row, four views, same size and pose height: front, three-quarter front, side, back. Bottom row, four poses: running, hiding (crouched, peeking), scared (jumping back), cheering. Same outfit and colours in all eight. A watchful kid in a yellow bomber jacket and purple trousers, big dark headphones around the neck, round goggles, a little handheld sound gadget.</w:t>
+      </w:r>
+    </w:p>
+    <w:p>
+      <w:pPr>
+        <w:pStyle w:val="Heading2"/>
+        <w:spacing w:after="80" w:before="240"/>
+      </w:pPr>
+      <w:r>
+        <w:t xml:space="preserve">9. Bramble</w:t>
+      </w:r>
+    </w:p>
+    <w:p>
+      <w:pPr>
+        <w:spacing w:after="120"/>
+      </w:pPr>
+      <w:r>
+        <w:rPr>
+          <w:b/>
+          <w:bCs/>
+          <w:sz w:val="24"/>
+          <w:szCs w:val="24"/>
+        </w:rPr>
+        <w:t xml:space="preserve">Save as: </w:t>
+      </w:r>
+      <w:r>
+        <w:rPr>
+          <w:sz w:val="24"/>
+          <w:szCs w:val="24"/>
+        </w:rPr>
+        <w:t xml:space="preserve">art/sheets/char-bramble.png</w:t>
+      </w:r>
+    </w:p>
+    <w:p>
+      <w:pPr>
+        <w:spacing w:after="120"/>
+      </w:pPr>
+      <w:r>
+        <w:rPr>
+          <w:b/>
+          <w:bCs/>
+          <w:sz w:val="24"/>
+          <w:szCs w:val="24"/>
+        </w:rPr>
+        <w:t xml:space="preserve">Size: </w:t>
+      </w:r>
+      <w:r>
+        <w:rPr>
+          <w:sz w:val="24"/>
+          <w:szCs w:val="24"/>
+        </w:rPr>
+        <w:t xml:space="preserve">Wide (1536 x 1024)</w:t>
+      </w:r>
+    </w:p>
+    <w:p>
+      <w:pPr>
+        <w:pBdr>
+          <w:left w:val="single" w:color="8A6BD1" w:sz="18" w:space="8"/>
+        </w:pBdr>
+        <w:shd w:fill="F1ECF8" w:color="auto" w:val="clear"/>
+        <w:spacing w:after="200" w:before="60"/>
+      </w:pPr>
+      <w:r>
+        <w:rPr>
+          <w:rFonts w:ascii="Arial" w:cs="Arial" w:eastAsia="Arial" w:hAnsi="Arial"/>
+          <w:sz w:val="24"/>
+          <w:szCs w:val="24"/>
+        </w:rPr>
+        <w:t xml:space="preserve">Stylised 3D game render, like a polished modern online kids' horror-escape game (hide-and-seek / murder-mystery style), for ages 8 and up. Realistic lighting and soft shadows, detailed materials (fabric, wood, plastic, metal), slightly chunky, appealing proportions. Creepy and tense but never gory: no blood, wounds, weapons or body horror. Not blocky toy avatars. No text, letters, logos, brand names or watermark. Character turnaround sheet of ONE child character, about 10 years old, full body, on a plain light grey background. Top row, four views, same size and pose height: front, three-quarter front, side, back. Bottom row, four poses: running, hiding (crouched, peeking), scared (jumping back), cheering. Same outfit and colours in all eight. An outdoorsy kid in a leaf-green poncho and brown cargo shorts, a crown of real leaves and one small flower in the hair, muddy boots, a pouch of seeds. Calm.</w:t>
+      </w:r>
+    </w:p>
+    <w:p>
+      <w:pPr>
+        <w:pStyle w:val="Heading1"/>
+        <w:pageBreakBefore/>
+      </w:pPr>
+      <w:r>
         <w:t xml:space="preserve">Hosts and jumpscares (3 themes)</w:t>
       </w:r>
     </w:p>
@@ -650,7 +727,7 @@
         <w:spacing w:after="80" w:before="240"/>
       </w:pPr>
       <w:r>
-        <w:t xml:space="preserve">9. The Party Host (Halloween) - turnaround</w:t>
+        <w:t xml:space="preserve">10. The Party Host (Halloween) - turnaround</w:t>
       </w:r>
     </w:p>
     <w:p>
@@ -718,7 +795,7 @@
         <w:spacing w:after="80" w:before="240"/>
       </w:pPr>
       <w:r>
-        <w:t xml:space="preserve">10. The Party Host (Halloween) - jumpscare</w:t>
+        <w:t xml:space="preserve">11. The Party Host (Halloween) - jumpscare</w:t>
       </w:r>
     </w:p>
     <w:p>
@@ -786,7 +863,7 @@
         <w:spacing w:after="80" w:before="240"/>
       </w:pPr>
       <w:r>
-        <w:t xml:space="preserve">11. The Jelly Ringmaster (Gummy theme) - turnaround</w:t>
+        <w:t xml:space="preserve">12. The Jelly Ringmaster (Gummy theme) - turnaround</w:t>
       </w:r>
     </w:p>
     <w:p>
@@ -854,7 +931,7 @@
         <w:spacing w:after="80" w:before="240"/>
       </w:pPr>
       <w:r>
-        <w:t xml:space="preserve">12. The Jelly Ringmaster (Gummy theme) - jumpscare</w:t>
+        <w:t xml:space="preserve">13. The Jelly Ringmaster (Gummy theme) - jumpscare</w:t>
       </w:r>
     </w:p>
     <w:p>
@@ -922,7 +999,7 @@
         <w:spacing w:after="80" w:before="240"/>
       </w:pPr>
       <w:r>
-        <w:t xml:space="preserve">13. The Night Shift (Hospital theme) - turnaround</w:t>
+        <w:t xml:space="preserve">14. The Night Shift (Hospital theme) - turnaround</w:t>
       </w:r>
     </w:p>
     <w:p>
@@ -990,7 +1067,7 @@
         <w:spacing w:after="80" w:before="240"/>
       </w:pPr>
       <w:r>
-        <w:t xml:space="preserve">14. The Night Shift (Hospital theme) - jumpscare</w:t>
+        <w:t xml:space="preserve">15. The Night Shift (Hospital theme) - jumpscare</w:t>
       </w:r>
     </w:p>
     <w:p>
@@ -1082,7 +1159,7 @@
         <w:spacing w:after="80" w:before="240"/>
       </w:pPr>
       <w:r>
-        <w:t xml:space="preserve">15. Parlour</w:t>
+        <w:t xml:space="preserve">16. Parlour</w:t>
       </w:r>
     </w:p>
     <w:p>
@@ -1150,7 +1227,7 @@
         <w:spacing w:after="80" w:before="240"/>
       </w:pPr>
       <w:r>
-        <w:t xml:space="preserve">16. Corridor</w:t>
+        <w:t xml:space="preserve">17. Corridor</w:t>
       </w:r>
     </w:p>
     <w:p>
@@ -1218,7 +1295,7 @@
         <w:spacing w:after="80" w:before="240"/>
       </w:pPr>
       <w:r>
-        <w:t xml:space="preserve">17. Library</w:t>
+        <w:t xml:space="preserve">18. Library</w:t>
       </w:r>
     </w:p>
     <w:p>
@@ -1286,7 +1363,7 @@
         <w:spacing w:after="80" w:before="240"/>
       </w:pPr>
       <w:r>
-        <w:t xml:space="preserve">18. Kitchen</w:t>
+        <w:t xml:space="preserve">19. Kitchen</w:t>
       </w:r>
     </w:p>
     <w:p>
@@ -1354,7 +1431,7 @@
         <w:spacing w:after="80" w:before="240"/>
       </w:pPr>
       <w:r>
-        <w:t xml:space="preserve">19. Front Hall</w:t>
+        <w:t xml:space="preserve">20. Front Hall</w:t>
       </w:r>
     </w:p>
     <w:p>
@@ -1422,7 +1499,7 @@
         <w:spacing w:after="80" w:before="240"/>
       </w:pPr>
       <w:r>
-        <w:t xml:space="preserve">20. Game Room</w:t>
+        <w:t xml:space="preserve">21. Game Room</w:t>
       </w:r>
     </w:p>
     <w:p>
@@ -1490,7 +1567,7 @@
         <w:spacing w:after="80" w:before="240"/>
       </w:pPr>
       <w:r>
-        <w:t xml:space="preserve">21. Garden (safe area)</w:t>
+        <w:t xml:space="preserve">22. Garden (safe area)</w:t>
       </w:r>
     </w:p>
     <w:p>
@@ -1573,7 +1650,7 @@
         <w:spacing w:after="80" w:before="240"/>
       </w:pPr>
       <w:r>
-        <w:t xml:space="preserve">22. Lobby</w:t>
+        <w:t xml:space="preserve">23. Lobby</w:t>
       </w:r>
     </w:p>
     <w:p>
@@ -1641,7 +1718,7 @@
         <w:spacing w:after="80" w:before="240"/>
       </w:pPr>
       <w:r>
-        <w:t xml:space="preserve">23. Gumdrop Pit</w:t>
+        <w:t xml:space="preserve">24. Gumdrop Pit</w:t>
       </w:r>
     </w:p>
     <w:p>
@@ -1709,7 +1786,7 @@
         <w:spacing w:after="80" w:before="240"/>
       </w:pPr>
       <w:r>
-        <w:t xml:space="preserve">24. Sprinkle Slide</w:t>
+        <w:t xml:space="preserve">25. Sprinkle Slide</w:t>
       </w:r>
     </w:p>
     <w:p>
@@ -1777,7 +1854,7 @@
         <w:spacing w:after="80" w:before="240"/>
       </w:pPr>
       <w:r>
-        <w:t xml:space="preserve">25. Caramel Vault</w:t>
+        <w:t xml:space="preserve">26. Caramel Vault</w:t>
       </w:r>
     </w:p>
     <w:p>
@@ -1845,7 +1922,7 @@
         <w:spacing w:after="80" w:before="240"/>
       </w:pPr>
       <w:r>
-        <w:t xml:space="preserve">26. Candyfloss Cloud (safe area)</w:t>
+        <w:t xml:space="preserve">27. Candyfloss Cloud (safe area)</w:t>
       </w:r>
     </w:p>
     <w:p>
@@ -1928,7 +2005,7 @@
         <w:spacing w:after="80" w:before="240"/>
       </w:pPr>
       <w:r>
-        <w:t xml:space="preserve">27. Waiting Room</w:t>
+        <w:t xml:space="preserve">28. Waiting Room</w:t>
       </w:r>
     </w:p>
     <w:p>
@@ -1996,7 +2073,7 @@
         <w:spacing w:after="80" w:before="240"/>
       </w:pPr>
       <w:r>
-        <w:t xml:space="preserve">28. Ward</w:t>
+        <w:t xml:space="preserve">29. Ward</w:t>
       </w:r>
     </w:p>
     <w:p>
@@ -2064,7 +2141,7 @@
         <w:spacing w:after="80" w:before="240"/>
       </w:pPr>
       <w:r>
-        <w:t xml:space="preserve">29. X-ray Room</w:t>
+        <w:t xml:space="preserve">30. X-ray Room</w:t>
       </w:r>
     </w:p>
     <w:p>
@@ -2132,7 +2209,7 @@
         <w:spacing w:after="80" w:before="240"/>
       </w:pPr>
       <w:r>
-        <w:t xml:space="preserve">30. Pharmacy</w:t>
+        <w:t xml:space="preserve">31. Pharmacy</w:t>
       </w:r>
     </w:p>
     <w:p>
@@ -2200,7 +2277,7 @@
         <w:spacing w:after="80" w:before="240"/>
       </w:pPr>
       <w:r>
-        <w:t xml:space="preserve">31. Boiler Room</w:t>
+        <w:t xml:space="preserve">32. Boiler Room</w:t>
       </w:r>
     </w:p>
     <w:p>
@@ -2268,7 +2345,7 @@
         <w:spacing w:after="80" w:before="240"/>
       </w:pPr>
       <w:r>
-        <w:t xml:space="preserve">32. Ambulance Bay (safe area)</w:t>
+        <w:t xml:space="preserve">33. Ambulance Bay (safe area)</w:t>
       </w:r>
     </w:p>
     <w:p>
@@ -2345,7 +2422,7 @@
         <w:spacing w:after="80" w:before="240"/>
       </w:pPr>
       <w:r>
-        <w:t xml:space="preserve">33. wood</w:t>
+        <w:t xml:space="preserve">34. wood</w:t>
       </w:r>
     </w:p>
     <w:p>
@@ -2413,7 +2490,7 @@
         <w:spacing w:after="80" w:before="240"/>
       </w:pPr>
       <w:r>
-        <w:t xml:space="preserve">34. darkwood</w:t>
+        <w:t xml:space="preserve">35. darkwood</w:t>
       </w:r>
     </w:p>
     <w:p>
@@ -2481,7 +2558,7 @@
         <w:spacing w:after="80" w:before="240"/>
       </w:pPr>
       <w:r>
-        <w:t xml:space="preserve">35. carpet-plum</w:t>
+        <w:t xml:space="preserve">36. carpet-plum</w:t>
       </w:r>
     </w:p>
     <w:p>
@@ -2549,7 +2626,7 @@
         <w:spacing w:after="80" w:before="240"/>
       </w:pPr>
       <w:r>
-        <w:t xml:space="preserve">36. carpet-green</w:t>
+        <w:t xml:space="preserve">37. carpet-green</w:t>
       </w:r>
     </w:p>
     <w:p>
@@ -2617,7 +2694,7 @@
         <w:spacing w:after="80" w:before="240"/>
       </w:pPr>
       <w:r>
-        <w:t xml:space="preserve">37. carpet-purple</w:t>
+        <w:t xml:space="preserve">38. carpet-purple</w:t>
       </w:r>
     </w:p>
     <w:p>
@@ -2685,7 +2762,7 @@
         <w:spacing w:after="80" w:before="240"/>
       </w:pPr>
       <w:r>
-        <w:t xml:space="preserve">38. tiles</w:t>
+        <w:t xml:space="preserve">39. tiles</w:t>
       </w:r>
     </w:p>
     <w:p>
@@ -2753,7 +2830,7 @@
         <w:spacing w:after="80" w:before="240"/>
       </w:pPr>
       <w:r>
-        <w:t xml:space="preserve">39. wallpaper</w:t>
+        <w:t xml:space="preserve">40. wallpaper</w:t>
       </w:r>
     </w:p>
     <w:p>
@@ -2830,7 +2907,7 @@
         <w:spacing w:after="80" w:before="240"/>
       </w:pPr>
       <w:r>
-        <w:t xml:space="preserve">40. Eyes</w:t>
+        <w:t xml:space="preserve">41. Eyes</w:t>
       </w:r>
     </w:p>
     <w:p>
@@ -2898,7 +2975,7 @@
         <w:spacing w:after="80" w:before="240"/>
       </w:pPr>
       <w:r>
-        <w:t xml:space="preserve">41. Eyebrows</w:t>
+        <w:t xml:space="preserve">42. Eyebrows</w:t>
       </w:r>
     </w:p>
     <w:p>
@@ -2966,7 +3043,7 @@
         <w:spacing w:after="80" w:before="240"/>
       </w:pPr>
       <w:r>
-        <w:t xml:space="preserve">42. Mouth</w:t>
+        <w:t xml:space="preserve">43. Mouth</w:t>
       </w:r>
     </w:p>
     <w:p>
@@ -3034,7 +3111,7 @@
         <w:spacing w:after="80" w:before="240"/>
       </w:pPr>
       <w:r>
-        <w:t xml:space="preserve">43. Nose</w:t>
+        <w:t xml:space="preserve">44. Nose</w:t>
       </w:r>
     </w:p>
     <w:p>
@@ -3102,7 +3179,7 @@
         <w:spacing w:after="80" w:before="240"/>
       </w:pPr>
       <w:r>
-        <w:t xml:space="preserve">44. Hair or headwear</w:t>
+        <w:t xml:space="preserve">45. Hair or headwear</w:t>
       </w:r>
     </w:p>
     <w:p>
@@ -3170,7 +3247,7 @@
         <w:spacing w:after="80" w:before="240"/>
       </w:pPr>
       <w:r>
-        <w:t xml:space="preserve">45. Top</w:t>
+        <w:t xml:space="preserve">46. Top</w:t>
       </w:r>
     </w:p>
     <w:p>
@@ -3238,7 +3315,7 @@
         <w:spacing w:after="80" w:before="240"/>
       </w:pPr>
       <w:r>
-        <w:t xml:space="preserve">46. Bottoms</w:t>
+        <w:t xml:space="preserve">47. Bottoms</w:t>
       </w:r>
     </w:p>
     <w:p>
@@ -3306,7 +3383,7 @@
         <w:spacing w:after="80" w:before="240"/>
       </w:pPr>
       <w:r>
-        <w:t xml:space="preserve">47. Shoes</w:t>
+        <w:t xml:space="preserve">48. Shoes</w:t>
       </w:r>
     </w:p>
     <w:p>
@@ -3374,7 +3451,7 @@
         <w:spacing w:after="80" w:before="240"/>
       </w:pPr>
       <w:r>
-        <w:t xml:space="preserve">48. Accessory</w:t>
+        <w:t xml:space="preserve">49. Accessory</w:t>
       </w:r>
     </w:p>
     <w:p>

</xml_diff>